<commit_message>
global_accessibility: add Discussion section to the manuscript draft
Co-Authored-By: Claude Opus 5.5 <noreply@anthropic.com>
Claude-Session: https://claude.ai/code/session_01Ses5XqMmtfDDhLGJ5mfib8
</commit_message>
<xml_diff>
--- a/global_accessibility/manuscript/Methods_Results.docx
+++ b/global_accessibility/manuscript/Methods_Results.docx
@@ -7012,6 +7012,287 @@
         <w:spacing w:after="120" w:before="240"/>
       </w:pPr>
       <w:r>
+        <w:t xml:space="preserve">4. Discussion</w:t>
+      </w:r>
+    </w:p>
+    <w:p>
+      <w:pPr>
+        <w:pBdr>
+          <w:left w:val="single" w:color="E0A800" w:sz="12" w:space="6"/>
+        </w:pBdr>
+        <w:shd w:fill="FFF4D6" w:val="clear"/>
+        <w:spacing w:after="160" w:before="80"/>
+      </w:pPr>
+      <w:r>
+        <w:rPr>
+          <w:color w:val="7A4F00"/>
+        </w:rPr>
+        <w:t xml:space="preserve">The discussion is written for the regional test; figures marked [global] and the scope of the claims should be revisited after the global run.</w:t>
+      </w:r>
+    </w:p>
+    <w:p>
+      <w:pPr>
+        <w:pStyle w:val="Heading2"/>
+        <w:spacing w:after="100" w:before="200"/>
+      </w:pPr>
+      <w:r>
+        <w:t xml:space="preserve">4.1 Principal findings</w:t>
+      </w:r>
+    </w:p>
+    <w:p>
+      <w:pPr>
+        <w:spacing w:after="120" w:line="300"/>
+        <w:jc w:val="both"/>
+      </w:pPr>
+      <w:r>
+        <w:t xml:space="preserve">We present a reproducible way to update global travel-time accessibility for any pair of years from open data, keeping the method fixed so that differences between years reflect the transport network and settlement growth. Applied to Benin, Togo and neighbouring areas, it shows a reduction of the population-weighted travel time to the nearest settlement of ≥50,000 inhabitants from 22.0 minutes in 2015 to 19.0 minutes in 2026, with the largest gains in the rural, less connected parts of Burkina Faso and Niger and smaller gains in coastal areas that were already well connected. Our 2015 estimates reproduce the Nelson et al. (2019) indicators for settlements closely once the 2015 road network is completed, and our 2026 estimates agree with OSRM routing within ±30% for 90% of the origin–settlement pairs tested.</w:t>
+      </w:r>
+    </w:p>
+    <w:p>
+      <w:pPr>
+        <w:pStyle w:val="Heading2"/>
+        <w:spacing w:after="100" w:before="200"/>
+      </w:pPr>
+      <w:r>
+        <w:t xml:space="preserve">4.2 Construction or mapping?</w:t>
+      </w:r>
+    </w:p>
+    <w:p>
+      <w:pPr>
+        <w:spacing w:after="120" w:line="300"/>
+        <w:jc w:val="both"/>
+      </w:pPr>
+      <w:r>
+        <w:t xml:space="preserve">The main difficulty in dating accessibility change with OSM is that the growth of the map is not the growth of the network. In the test domain, OSM road length grew almost five-fold between 2015 and 2026, mostly as unclassified, residential and track roads, which fits the pattern of humanitarian and corporate mapping campaigns better than that of construction; the decrease in primary roads alongside an increase in trunk roads points to reclassification. Using OSM 2015 as it was would attribute to 2015–2026 many roads that already existed. Completing the 2015 network with the Weiss et al. (2018) surface, which drew on Google road data in addition to OSM, doubled the number of 2015 road cells and reduced the apparent 2015–2026 gain from about 15 minutes to 3 minutes for settlements of ≥50,000, while raising the agreement with Nelson et al. (2019) from r = 0.80 to 0.89. We consider the completed estimate the more credible one, but it is still an upper bound on the effect of new roads: roads that exist in 2026 but were missing from both OSM 2015 and the 2015 Google data are counted as new, and completeness of OSM 2015 remained below 80% in all tiles of the domain even before completion. Separating construction from mapping more strictly would require dated road inventories or multi-temporal imagery.</w:t>
+      </w:r>
+    </w:p>
+    <w:p>
+      <w:pPr>
+        <w:pStyle w:val="Heading2"/>
+        <w:spacing w:after="100" w:before="200"/>
+      </w:pPr>
+      <w:r>
+        <w:t xml:space="preserve">4.3 Comparison with previous global products</w:t>
+      </w:r>
+    </w:p>
+    <w:p>
+      <w:pPr>
+        <w:spacing w:after="120" w:line="300"/>
+        <w:jc w:val="both"/>
+      </w:pPr>
+      <w:r>
+        <w:t xml:space="preserve">After completion, the settlement layers agree well with Nelson et al. (2019) in both level and pattern, despite differences in inputs: GHSL R2023A rather than the 2016 settlement layers, WorldCover rather than the earlier land cover, a different speed table and our governance and border penalties. The port layers agree in pattern (r = 0.97) but are about one hour longer in our estimates. In the regional test this is expected at least partly, because ports outside the domain, among them the larger ports of Lagos, Tema and Abidjan, cannot be reached; whether a difference remains in the global run is to be verified [global]. Differences in the World Port Index edition (current against the 26th edition used by Nelson et al.) may also contribute.</w:t>
+      </w:r>
+    </w:p>
+    <w:p>
+      <w:pPr>
+        <w:pStyle w:val="Heading2"/>
+        <w:spacing w:after="100" w:before="200"/>
+      </w:pPr>
+      <w:r>
+        <w:t xml:space="preserve">4.4 Validation</w:t>
+      </w:r>
+    </w:p>
+    <w:p>
+      <w:pPr>
+        <w:spacing w:after="120" w:line="300"/>
+        <w:jc w:val="both"/>
+      </w:pPr>
+      <w:r>
+        <w:t xml:space="preserve">The agreement with OSRM (median ratio 0.98) indicates that our speeds and least-cost computation reproduce routed car travel times on the current network. It is not an independent validation of the network itself, since both rely on OSM, and OSRM free-flow times are a lower bound for real trips: they include no congestion, no stops and no border delays. Nelson et al. (2019), using Google journey times, found their estimates shorter than Google's in 72% of validation tiles (median difference −13.7 minutes), which suggests that routing-engine times are a more lenient benchmark than observed trips. The routing validation is available only for the end year, because free routing engines use current data; for the start year, the comparison with Nelson et al. (2019) is the closest available reference.</w:t>
+      </w:r>
+    </w:p>
+    <w:p>
+      <w:pPr>
+        <w:pStyle w:val="Heading2"/>
+        <w:spacing w:after="100" w:before="200"/>
+      </w:pPr>
+      <w:r>
+        <w:t xml:space="preserve">4.5 Governance and border penalties</w:t>
+      </w:r>
+    </w:p>
+    <w:p>
+      <w:pPr>
+        <w:spacing w:after="120" w:line="300"/>
+        <w:jc w:val="both"/>
+      </w:pPr>
+      <w:r>
+        <w:t xml:space="preserve">The governance and border penalties are new relative to earlier global maps and rest on assumptions rather than measurements. With </w:t>
+      </w:r>
+      <w:r>
+        <w:rPr>
+          <w:i/>
+          <w:iCs/>
+        </w:rPr>
+        <w:t xml:space="preserve">K</w:t>
+      </w:r>
+      <w:r>
+        <w:t xml:space="preserve"> = 0.10 they slow roads by 5.6–7.5% in the test domain and add about one minute to the 15-minute delay at each official crossing. They were chosen to be small, so that they modulate rather than dominate the results, and because we are not aware of empirical estimates that relate corruption scores to travel speed or crossing times for people. We apply the border delay only between African countries and only at crossings on major roads, including within ECOWAS, whose free-movement protocol does not remove border procedures in practice. Travellers crossing on foot away from these roads are not delayed, which is realistic for informal crossings but lets some least-cost paths bypass a checkpoint at walking speed. Both parameters should be varied in a sensitivity analysis (e.g. </w:t>
+      </w:r>
+      <w:r>
+        <w:rPr>
+          <w:i/>
+          <w:iCs/>
+        </w:rPr>
+        <w:t xml:space="preserve">K</w:t>
+      </w:r>
+      <w:r>
+        <w:t xml:space="preserve"> = 0, 0.05, 0.10, 0.20; delays of 0, 15, 30 and 60 minutes).</w:t>
+      </w:r>
+    </w:p>
+    <w:p>
+      <w:pPr>
+        <w:pStyle w:val="Heading2"/>
+        <w:spacing w:after="100" w:before="200"/>
+      </w:pPr>
+      <w:r>
+        <w:t xml:space="preserve">4.6 Limitations</w:t>
+      </w:r>
+    </w:p>
+    <w:p>
+      <w:pPr>
+        <w:pStyle w:val="ListParagraph"/>
+        <w:numPr>
+          <w:ilvl w:val="0"/>
+          <w:numId w:val="2"/>
+        </w:numPr>
+        <w:spacing w:after="60" w:line="290"/>
+      </w:pPr>
+      <w:r>
+        <w:rPr>
+          <w:b/>
+          <w:bCs/>
+        </w:rPr>
+        <w:t xml:space="preserve">Speeds are not calibrated.</w:t>
+      </w:r>
+      <w:r>
+        <w:t xml:space="preserve"> Road speeds follow common practice and walking speeds are placeholders (Table S3); both affect absolute travel times more than any other choice and should be calibrated, for example against the OSRM pairs, survey data or local knowledge.</w:t>
+      </w:r>
+    </w:p>
+    <w:p>
+      <w:pPr>
+        <w:pStyle w:val="ListParagraph"/>
+        <w:numPr>
+          <w:ilvl w:val="0"/>
+          <w:numId w:val="2"/>
+        </w:numPr>
+        <w:spacing w:after="60" w:line="290"/>
+      </w:pPr>
+      <w:r>
+        <w:rPr>
+          <w:b/>
+          <w:bCs/>
+        </w:rPr>
+        <w:t xml:space="preserve">Fixed land cover and water.</w:t>
+      </w:r>
+      <w:r>
+        <w:t xml:space="preserve"> One land-cover map (2021) is used for both years, so land-cover change does not contribute to the change in accessibility. Ferries and navigable waterways are not modelled, which makes islands served only by ferry unreachable from the mainland.</w:t>
+      </w:r>
+    </w:p>
+    <w:p>
+      <w:pPr>
+        <w:pStyle w:val="ListParagraph"/>
+        <w:numPr>
+          <w:ilvl w:val="0"/>
+          <w:numId w:val="2"/>
+        </w:numPr>
+        <w:spacing w:after="60" w:line="290"/>
+      </w:pPr>
+      <w:r>
+        <w:rPr>
+          <w:b/>
+          <w:bCs/>
+        </w:rPr>
+        <w:t xml:space="preserve">Settlements.</w:t>
+      </w:r>
+      <w:r>
+        <w:t xml:space="preserve"> Destinations come from GHSL epochs (2015, 2025); the 2025 epoch is a projection [check], and single-class layers can change because settlements move between population classes rather than because access changes (Section 3.2).</w:t>
+      </w:r>
+    </w:p>
+    <w:p>
+      <w:pPr>
+        <w:pStyle w:val="ListParagraph"/>
+        <w:numPr>
+          <w:ilvl w:val="0"/>
+          <w:numId w:val="2"/>
+        </w:numPr>
+        <w:spacing w:after="60" w:line="290"/>
+      </w:pPr>
+      <w:r>
+        <w:rPr>
+          <w:b/>
+          <w:bCs/>
+        </w:rPr>
+        <w:t xml:space="preserve">Microsoft road detections</w:t>
+      </w:r>
+      <w:r>
+        <w:t xml:space="preserve"> are undated and are used for the end year only; their contribution is therefore attributed entirely to the end year.</w:t>
+      </w:r>
+    </w:p>
+    <w:p>
+      <w:pPr>
+        <w:pStyle w:val="ListParagraph"/>
+        <w:numPr>
+          <w:ilvl w:val="0"/>
+          <w:numId w:val="2"/>
+        </w:numPr>
+        <w:spacing w:after="60" w:line="290"/>
+      </w:pPr>
+      <w:r>
+        <w:rPr>
+          <w:b/>
+          <w:bCs/>
+        </w:rPr>
+        <w:t xml:space="preserve">Resolution and mode.</w:t>
+      </w:r>
+      <w:r>
+        <w:t xml:space="preserve"> At 30″, all roads in a cell take the fastest speed, and travel is modelled as a single fastest mode without seasonality, congestion or vehicle availability.</w:t>
+      </w:r>
+    </w:p>
+    <w:p>
+      <w:pPr>
+        <w:pStyle w:val="ListParagraph"/>
+        <w:numPr>
+          <w:ilvl w:val="0"/>
+          <w:numId w:val="2"/>
+        </w:numPr>
+        <w:spacing w:after="60" w:line="290"/>
+      </w:pPr>
+      <w:r>
+        <w:rPr>
+          <w:b/>
+          <w:bCs/>
+        </w:rPr>
+        <w:t xml:space="preserve">Regional test.</w:t>
+      </w:r>
+      <w:r>
+        <w:t xml:space="preserve"> The domain boundary truncates destinations outside it and parts of the neighbouring countries; country values for Ghana, Nigeria, Burkina Faso and Niger are not representative of those countries [global].</w:t>
+      </w:r>
+    </w:p>
+    <w:p>
+      <w:pPr>
+        <w:pStyle w:val="Heading2"/>
+        <w:spacing w:after="100" w:before="200"/>
+      </w:pPr>
+      <w:r>
+        <w:t xml:space="preserve">4.7 Outlook</w:t>
+      </w:r>
+    </w:p>
+    <w:p>
+      <w:pPr>
+        <w:spacing w:after="120" w:line="300"/>
+        <w:jc w:val="both"/>
+      </w:pPr>
+      <w:r>
+        <w:t xml:space="preserve">Because the workflow is a single script with the reference years as parameters, the maps can be updated as new OSM snapshots and GHSL epochs become available, and extended to other start years for which a reference network exists. Priorities for the global application are to report the comparison with Nelson et al. (2019) for tiles where OSM 2015 was complete, to run the sensitivity analyses of the governance and border parameters, and to calibrate the speed tables against the routing validation pairs [global].</w:t>
+      </w:r>
+    </w:p>
+    <w:p>
+      <w:pPr>
+        <w:pStyle w:val="Heading1"/>
+        <w:spacing w:after="120" w:before="240"/>
+      </w:pPr>
+      <w:r>
         <w:t xml:space="preserve">References</w:t>
       </w:r>
     </w:p>
@@ -7407,6 +7688,12 @@
   </w:abstractNum>
   <w:num w:numId="1">
     <w:abstractNumId w:val="1"/>
+    <w:lvlOverride w:ilvl="0">
+      <w:startOverride w:val="1"/>
+    </w:lvlOverride>
+  </w:num>
+  <w:num w:numId="2">
+    <w:abstractNumId w:val="2"/>
     <w:lvlOverride w:ilvl="0">
       <w:startOverride w:val="1"/>
     </w:lvlOverride>

</xml_diff>